<commit_message>
Systeemveld hernoemd naar Opmerking en scenario_02 exact volgens de opdracht
De opdracht schrijft het systeemveld Opmerking voor; het createscript,
de database, de export en de Database Specificatie Tabel gebruiken die
naam nu. De melding bij een product zonder voorraad toont de datum
30-04-2023, letterlijk zoals scenario_02 van user story 01 hem noemt.
De ongebruikte model-method voor die datum is verwijderd.
</commit_message>
<xml_diff>
--- a/docs/Database Specificatie Tabel.docx
+++ b/docs/Database Specificatie Tabel.docx
@@ -49,7 +49,7 @@
           <w:sz w:val="20"/>
           <w:szCs w:val="20"/>
         </w:rPr>
-        <w:t xml:space="preserve">Alle tabellen bevatten de systeemvelden IsActief, Opmerkingen, DatumAangemaakt en DatumGewijzigd. De stamtabellen staan eerst, daarna de koppeltabellen.</w:t>
+        <w:t xml:space="preserve">Alle tabellen bevatten de systeemvelden IsActief, Opmerking, DatumAangemaakt en DatumGewijzigd. De stamtabellen staan eerst, daarna de koppeltabellen.</w:t>
       </w:r>
     </w:p>
     <w:p>
@@ -525,7 +525,7 @@
                 <w:sz w:val="19"/>
                 <w:szCs w:val="19"/>
               </w:rPr>
-              <w:t xml:space="preserve">Opmerkingen</w:t>
+              <w:t xml:space="preserve">Opmerking</w:t>
             </w:r>
           </w:p>
         </w:tc>
@@ -1232,7 +1232,7 @@
                 <w:sz w:val="19"/>
                 <w:szCs w:val="19"/>
               </w:rPr>
-              <w:t xml:space="preserve">Opmerkingen</w:t>
+              <w:t xml:space="preserve">Opmerking</w:t>
             </w:r>
           </w:p>
         </w:tc>
@@ -2103,7 +2103,7 @@
                 <w:sz w:val="19"/>
                 <w:szCs w:val="19"/>
               </w:rPr>
-              <w:t xml:space="preserve">Opmerkingen</w:t>
+              <w:t xml:space="preserve">Opmerking</w:t>
             </w:r>
           </w:p>
         </w:tc>
@@ -2892,7 +2892,7 @@
                 <w:sz w:val="19"/>
                 <w:szCs w:val="19"/>
               </w:rPr>
-              <w:t xml:space="preserve">Opmerkingen</w:t>
+              <w:t xml:space="preserve">Opmerking</w:t>
             </w:r>
           </w:p>
         </w:tc>
@@ -3599,7 +3599,7 @@
                 <w:sz w:val="19"/>
                 <w:szCs w:val="19"/>
               </w:rPr>
-              <w:t xml:space="preserve">Opmerkingen</w:t>
+              <w:t xml:space="preserve">Opmerking</w:t>
             </w:r>
           </w:p>
         </w:tc>
@@ -4552,7 +4552,7 @@
                 <w:sz w:val="19"/>
                 <w:szCs w:val="19"/>
               </w:rPr>
-              <w:t xml:space="preserve">Opmerkingen</w:t>
+              <w:t xml:space="preserve">Opmerking</w:t>
             </w:r>
           </w:p>
         </w:tc>

</xml_diff>